<commit_message>
PR122: merge current-safe BRAND_V3 semantics
</commit_message>
<xml_diff>
--- a/docs/development/DEVELOPMENT_V27_ECOLOGY_V11_20261014.docx
+++ b/docs/development/DEVELOPMENT_V27_ECOLOGY_V11_20261014.docx
@@ -9,7 +9,7 @@
       <w:bookmarkStart w:id="22" w:name="_GoBack"/>
       <w:bookmarkEnd w:id="22"/>
       <w:r>
-        <w:t>玄钧云汇开发架构与开发顺序</w:t>
+        <w:t>玄钧AI新开发架构与开发顺序</w:t>
       </w:r>
     </w:p>
     <w:p>
@@ -32,7 +32,7 @@
     </w:p>
     <w:p>
       <w:r>
-        <w:t>玄钧云汇定位为 AI 企业解决方案超市，通过模块市场、方案组合器、AI 产品经理和企业运营层，将客户需求转化为可购买、可部署、可计量、可持续复用的企业能力。</w:t>
+        <w:t>玄钧AI新定位为 AI 企业解决方案超市，通过模块市场、方案组合器、AI 产品经理和企业运营层，将客户需求转化为可购买、可部署、可计量、可持续复用的企业能力。</w:t>
       </w:r>
     </w:p>
     <w:p>
@@ -531,7 +531,7 @@
           <w:color w:val="000000"/>
           <w:sz w:val="21"/>
         </w:rPr>
-        <w:t>15 阶段2 玄钧云汇共享 Foundation</w:t>
+        <w:t>15 阶段2 玄钧AI新共享 Foundation</w:t>
       </w:r>
       <w:r>
         <w:rPr>
@@ -3811,7 +3811,7 @@
     </w:p>
     <w:p>
       <w:r>
-        <w:t>金融板块是玄钧云汇的新增专业板块，提供客户自主配置策略、风控、交易授权、部署与运行管理。原有币安直接跟单和并联带单业务不变，策略、账户与收费保持独立，不把自主模式自动接入统一策略。当前为PLANNED_NOT_LAUNCHED，本文件不是上线证明。</w:t>
+        <w:t>金融板块是玄钧AI新的新增专业板块，提供客户自主配置策略、风控、交易授权、部署与运行管理。原有币安直接跟单和并联带单业务不变，策略、账户与收费保持独立，不把自主模式自动接入统一策略。当前为PLANNED_NOT_LAUNCHED，本文件不是上线证明。</w:t>
       </w:r>
     </w:p>
     <w:p>
@@ -5914,7 +5914,7 @@
         <w:spacing w:after="100"/>
       </w:pPr>
       <w:r>
-        <w:t>玄钧云汇生态体系以“共建、共治、共享”为核心理念，构建一个由消费者、推广者、开发者、生态合作伙伴以及创始团队共同参与发展的长期商业生态。</w:t>
+        <w:t>玄钧AI新生态体系以“共建、共治、共享”为核心理念，构建一个由消费者、推广者、开发者、生态合作伙伴以及创始团队共同参与发展的长期商业生态。</w:t>
       </w:r>
     </w:p>
     <w:p>
@@ -5932,7 +5932,7 @@
         <w:spacing w:after="100"/>
       </w:pPr>
       <w:r>
-        <w:t>玄钧云汇希望通过生态权益机制，将不同角色创造的价值进行量化，使每一个真正参与生态建设的人，都能够成为生态发展的参与者、建设者和共享者。</w:t>
+        <w:t>玄钧AI新希望通过生态权益机制，将不同角色创造的价值进行量化，使每一个真正参与生态建设的人，都能够成为生态发展的参与者、建设者和共享者。</w:t>
       </w:r>
     </w:p>
     <w:p>
@@ -5949,7 +5949,7 @@
         <w:pStyle w:val="5"/>
       </w:pPr>
       <w:r>
-        <w:t>7.7.2 玄钧云汇生态权益总量设计</w:t>
+        <w:t>7.7.2 玄钧AI新生态权益总量设计</w:t>
       </w:r>
     </w:p>
     <w:p>
@@ -5958,7 +5958,7 @@
         <w:spacing w:after="100"/>
       </w:pPr>
       <w:r>
-        <w:t>玄钧云汇生态权益总量永久限定为：</w:t>
+        <w:t>玄钧AI新生态权益总量永久限定为：</w:t>
       </w:r>
     </w:p>
     <w:p>
@@ -6084,7 +6084,7 @@
         <w:spacing w:after="100"/>
       </w:pPr>
       <w:r>
-        <w:t>创始生态权益用于体现创始团队在玄钧云汇生态建设过程中的长期贡献，包括：</w:t>
+        <w:t>创始生态权益用于体现创始团队在玄钧AI新生态建设过程中的长期贡献，包括：</w:t>
       </w:r>
     </w:p>
     <w:p>
@@ -6138,7 +6138,7 @@
         <w:spacing w:after="100"/>
       </w:pPr>
       <w:r>
-        <w:t>生态共建权益用于奖励所有参与玄钧云汇生态建设的成员，包括：</w:t>
+        <w:t>生态共建权益用于奖励所有参与玄钧AI新生态建设的成员，包括：</w:t>
       </w:r>
     </w:p>
     <w:p>
@@ -6218,7 +6218,7 @@
         <w:spacing w:after="100"/>
       </w:pPr>
       <w:r>
-        <w:t>玄钧云汇生态权益采用：</w:t>
+        <w:t>玄钧AI新生态权益采用：</w:t>
       </w:r>
     </w:p>
     <w:p>
@@ -6245,7 +6245,7 @@
         <w:spacing w:after="100"/>
       </w:pPr>
       <w:r>
-        <w:t>交易贡献池的阶段依据为玄钧云汇累计有效交易额；活动专项池按第十二节独立规则释放，不能把粉丝授权、关注、领取或创始人同步释放算作交易额。</w:t>
+        <w:t>交易贡献池的阶段依据为玄钧AI新累计有效交易额；活动专项池按第十二节独立规则释放，不能把粉丝授权、关注、领取或创始人同步释放算作交易额。</w:t>
       </w:r>
     </w:p>
     <w:p>
@@ -6334,7 +6334,7 @@
         <w:spacing w:after="100"/>
       </w:pPr>
       <w:r>
-        <w:t>玄钧云汇累计有效交易额0至1亿元人民币等值以内（含1亿元）。</w:t>
+        <w:t>玄钧AI新累计有效交易额0至1亿元人民币等值以内（含1亿元）。</w:t>
       </w:r>
     </w:p>
     <w:p>
@@ -6468,7 +6468,7 @@
         <w:spacing w:after="100"/>
       </w:pPr>
       <w:r>
-        <w:t>玄钧云汇累计有效交易额超过1亿元、且不超过10亿元人民币等值。</w:t>
+        <w:t>玄钧AI新累计有效交易额超过1亿元、且不超过10亿元人民币等值。</w:t>
       </w:r>
     </w:p>
     <w:p>
@@ -6602,7 +6602,7 @@
         <w:spacing w:after="100"/>
       </w:pPr>
       <w:r>
-        <w:t>玄钧云汇累计有效交易额超过10亿元人民币等值。</w:t>
+        <w:t>玄钧AI新累计有效交易额超过10亿元人民币等值。</w:t>
       </w:r>
     </w:p>
     <w:p>
@@ -6861,7 +6861,7 @@
         <w:spacing w:after="100"/>
       </w:pPr>
       <w:r>
-        <w:t>依法依规、符合规则且有效入账的玄钧云汇生态权益永久有效；误发、重复发放、退款关联调整和确认作弊的冲正不属于时间到期清零，须保留原记录与调整凭证。</w:t>
+        <w:t>依法依规、符合规则且有效入账的玄钧AI新生态权益永久有效；误发、重复发放、退款关联调整和确认作弊的冲正不属于时间到期清零，须保留原记录与调整凭证。</w:t>
       </w:r>
     </w:p>
     <w:p>
@@ -6941,7 +6941,7 @@
         <w:spacing w:after="100"/>
       </w:pPr>
       <w:r>
-        <w:t>玄钧云汇未来经营产生利润后，将根据企业发展情况建立生态价值共享机制。</w:t>
+        <w:t>玄钧AI新未来经营产生利润后，将根据企业发展情况建立生态价值共享机制。</w:t>
       </w:r>
     </w:p>
     <w:p>
@@ -7066,7 +7066,7 @@
         <w:spacing w:after="100"/>
       </w:pPr>
       <w:r>
-        <w:t>玄钧云汇生态权益持有人拥有生态治理参与权。</w:t>
+        <w:t>玄钧AI新生态权益持有人拥有生态治理参与权。</w:t>
       </w:r>
     </w:p>
     <w:p>
@@ -7200,7 +7200,7 @@
         <w:spacing w:after="100"/>
       </w:pPr>
       <w:r>
-        <w:t>玄钧云汇生态体系通过固定1000万生态权益总量，结合三档各300万的递减释放机制、100万活动专项池及创始人同比释放机制，将消费者、推广者、开发者、生态赞助者以及创始团队连接成为共同发展的生态共同体。</w:t>
+        <w:t>玄钧AI新生态体系通过固定1000万生态权益总量，结合三档各300万的递减释放机制、100万活动专项池及创始人同比释放机制，将消费者、推广者、开发者、生态赞助者以及创始团队连接成为共同发展的生态共同体。</w:t>
       </w:r>
     </w:p>
     <w:p>
@@ -7299,7 +7299,7 @@
         <w:spacing w:after="100"/>
       </w:pPr>
       <w:r>
-        <w:t>玄钧云汇希望建立的不只是一个商业平台，而是一套能够长期运行的生态共建体系。</w:t>
+        <w:t>玄钧AI新希望建立的不只是一个商业平台，而是一套能够长期运行的生态共建体系。</w:t>
       </w:r>
     </w:p>
     <w:p>
@@ -16170,7 +16170,7 @@
                 <w:b w:val="0"/>
                 <w:sz w:val="18"/>
               </w:rPr>
-              <w:t>玄钧云汇 Foundation</w:t>
+              <w:t>玄钧AI新 Foundation</w:t>
             </w:r>
           </w:p>
         </w:tc>
@@ -18456,7 +18456,7 @@
       </w:pPr>
       <w:bookmarkStart w:id="14" w:name="chapter_15"/>
       <w:r>
-        <w:t>15 阶段2 玄钧云汇共享 Foundation</w:t>
+        <w:t>15 阶段2 玄钧AI新共享 Foundation</w:t>
       </w:r>
       <w:bookmarkEnd w:id="14"/>
     </w:p>
@@ -20157,7 +20157,7 @@
         <w:pStyle w:val="4"/>
       </w:pPr>
       <w:r>
-        <w:t>23.2 结合玄钧云汇的业务与基础设施</w:t>
+        <w:t>23.2 结合玄钧AI新的业务与基础设施</w:t>
       </w:r>
     </w:p>
     <w:p>
@@ -20228,7 +20228,7 @@
     </w:p>
     <w:p>
       <w:r>
-        <w:t>建立玄钧AI实验室、玄钧云汇及英文名称之间的关系，确定一个统一英文写法。</w:t>
+        <w:t>建立玄钧AI实验室、玄钧AI新及英文名称之间的关系，确定一个统一英文写法。</w:t>
       </w:r>
     </w:p>
     <w:p>
@@ -21119,7 +21119,7 @@
     </w:p>
     <w:p>
       <w:r>
-        <w:t>GEO是玄钧云汇SaaS的功能板块之一，不建立独立推荐返佣政策。</w:t>
+        <w:t>GEO是玄钧AI新SaaS的功能板块之一，不建立独立推荐返佣政策。</w:t>
       </w:r>
     </w:p>
     <w:p>
@@ -21286,7 +21286,7 @@
       <w:rPr>
         <w:sz w:val="16"/>
       </w:rPr>
-      <w:t xml:space="preserve">玄钧云汇  开发架构与开发顺序 V2.6   |   </w:t>
+      <w:t xml:space="preserve">玄钧AI新  开发架构与开发顺序 V2.6   |   </w:t>
     </w:r>
     <w:r>
       <w:fldChar w:fldCharType="begin"/>

</xml_diff>